<commit_message>
Improve test reporting and CI workflow
</commit_message>
<xml_diff>
--- a/prompts/PromptsUsed.docx
+++ b/prompts/PromptsUsed.docx
@@ -2,6 +2,53 @@
 <file path=word/document.xml><?xml version="1.0" encoding="utf-8"?>
 <w:document xmlns:wpc="http://schemas.microsoft.com/office/word/2010/wordprocessingCanvas" xmlns:cx="http://schemas.microsoft.com/office/drawing/2014/chartex" xmlns:cx1="http://schemas.microsoft.com/office/drawing/2015/9/8/chartex" xmlns:cx2="http://schemas.microsoft.com/office/drawing/2015/10/21/chartex" xmlns:cx3="http://schemas.microsoft.com/office/drawing/2016/5/9/chartex" xmlns:cx4="http://schemas.microsoft.com/office/drawing/2016/5/10/chartex" xmlns:cx5="http://schemas.microsoft.com/office/drawing/2016/5/11/chartex" xmlns:cx6="http://schemas.microsoft.com/office/drawing/2016/5/12/chartex" xmlns:cx7="http://schemas.microsoft.com/office/drawing/2016/5/13/chartex" xmlns:cx8="http://schemas.microsoft.com/office/drawing/2016/5/14/chartex" xmlns:mc="http://schemas.openxmlformats.org/markup-compatibility/2006" xmlns:aink="http://schemas.microsoft.com/office/drawing/2016/ink" xmlns:am3d="http://schemas.microsoft.com/office/drawing/2017/model3d" xmlns:o="urn:schemas-microsoft-com:office:office" xmlns:oel="http://schemas.microsoft.com/office/2019/extlst" xmlns:r="http://schemas.openxmlformats.org/officeDocument/2006/relationships" xmlns:m="http://schemas.openxmlformats.org/officeDocument/2006/math" xmlns:v="urn:schemas-microsoft-com:vml" xmlns:wp14="http://schemas.microsoft.com/office/word/2010/wordprocessingDrawing" xmlns:wp="http://schemas.openxmlformats.org/drawingml/2006/wordprocessingDrawing" xmlns:w10="urn:schemas-microsoft-com:office:word" xmlns:w="http://schemas.openxmlformats.org/wordprocessingml/2006/main" xmlns:w14="http://schemas.microsoft.com/office/word/2010/wordml" xmlns:w15="http://schemas.microsoft.com/office/word/2012/wordml" xmlns:w16cex="http://schemas.microsoft.com/office/word/2018/wordml/cex" xmlns:w16cid="http://schemas.microsoft.com/office/word/2016/wordml/cid" xmlns:w16="http://schemas.microsoft.com/office/word/2018/wordml" xmlns:w16du="http://schemas.microsoft.com/office/word/2023/wordml/word16du" xmlns:w16sdtdh="http://schemas.microsoft.com/office/word/2020/wordml/sdtdatahash" xmlns:w16sdtfl="http://schemas.microsoft.com/office/word/2024/wordml/sdtformatlock" xmlns:w16se="http://schemas.microsoft.com/office/word/2015/wordml/symex" xmlns:wpg="http://schemas.microsoft.com/office/word/2010/wordprocessingGroup" xmlns:wpi="http://schemas.microsoft.com/office/word/2010/wordprocessingInk" xmlns:wne="http://schemas.microsoft.com/office/word/2006/wordml" xmlns:wps="http://schemas.microsoft.com/office/word/2010/wordprocessingShape" mc:Ignorable="w14 w15 w16se w16cid w16 w16cex w16sdtdh w16sdtfl w16du wp14">
   <w:body>
+    <w:p>
+      <w:pPr>
+        <w:pStyle w:val="Heading2"/>
+        <w:numPr>
+          <w:ilvl w:val="0"/>
+          <w:numId w:val="2"/>
+        </w:numPr>
+      </w:pPr>
+      <w:proofErr w:type="spellStart"/>
+      <w:r>
+        <w:t>Safdfd</w:t>
+      </w:r>
+      <w:proofErr w:type="spellEnd"/>
+    </w:p>
+    <w:tbl>
+      <w:tblPr>
+        <w:tblStyle w:val="TableGrid"/>
+        <w:tblW w:w="0" w:type="auto"/>
+        <w:tblLook w:val="04A0" w:firstRow="1" w:lastRow="0" w:firstColumn="1" w:lastColumn="0" w:noHBand="0" w:noVBand="1"/>
+      </w:tblPr>
+      <w:tblGrid>
+        <w:gridCol w:w="9016"/>
+      </w:tblGrid>
+      <w:tr>
+        <w:tc>
+          <w:tcPr>
+            <w:tcW w:w="9016" w:type="dxa"/>
+          </w:tcPr>
+          <w:p/>
+          <w:p>
+            <w:r>
+              <w:t xml:space="preserve">add a screenshot in allure reports </w:t>
+            </w:r>
+            <w:proofErr w:type="spellStart"/>
+            <w:r>
+              <w:t>when ever</w:t>
+            </w:r>
+            <w:proofErr w:type="spellEnd"/>
+            <w:r>
+              <w:t xml:space="preserve"> there is an assert or verification for all web/mobile tests</w:t>
+            </w:r>
+          </w:p>
+          <w:p/>
+        </w:tc>
+      </w:tr>
+    </w:tbl>
+    <w:p/>
     <w:p>
       <w:pPr>
         <w:pStyle w:val="Heading2"/>
@@ -63,34 +110,42 @@
               <w:t xml:space="preserve">Test Case </w:t>
             </w:r>
             <w:proofErr w:type="spellStart"/>
+            <w:proofErr w:type="gramStart"/>
             <w:r>
               <w:t>ID,Test</w:t>
             </w:r>
             <w:proofErr w:type="spellEnd"/>
+            <w:proofErr w:type="gramEnd"/>
             <w:r>
               <w:t xml:space="preserve"> Case </w:t>
             </w:r>
             <w:proofErr w:type="spellStart"/>
+            <w:proofErr w:type="gramStart"/>
             <w:r>
               <w:t>Description,Test</w:t>
             </w:r>
             <w:proofErr w:type="spellEnd"/>
+            <w:proofErr w:type="gramEnd"/>
             <w:r>
               <w:t xml:space="preserve"> </w:t>
             </w:r>
             <w:proofErr w:type="spellStart"/>
+            <w:proofErr w:type="gramStart"/>
             <w:r>
               <w:t>Steps,Test</w:t>
             </w:r>
             <w:proofErr w:type="spellEnd"/>
+            <w:proofErr w:type="gramEnd"/>
             <w:r>
               <w:t xml:space="preserve"> </w:t>
             </w:r>
             <w:proofErr w:type="spellStart"/>
+            <w:proofErr w:type="gramStart"/>
             <w:r>
               <w:t>Data,Expected</w:t>
             </w:r>
             <w:proofErr w:type="spellEnd"/>
+            <w:proofErr w:type="gramEnd"/>
             <w:r>
               <w:t xml:space="preserve"> Result</w:t>
             </w:r>
@@ -104,13 +159,26 @@
               <w:ind w:left="360"/>
             </w:pPr>
             <w:r>
-              <w:t xml:space="preserve">TC-VAL-01,Empty Field Validation,1. Open Login Page2. Leave Email empty3. Leave Password empty4. Click 'LOG </w:t>
-            </w:r>
-            <w:proofErr w:type="spellStart"/>
-            <w:r>
-              <w:t>IN',Email</w:t>
-            </w:r>
-            <w:proofErr w:type="spellEnd"/>
+              <w:t>TC-VAL-</w:t>
+            </w:r>
+            <w:proofErr w:type="gramStart"/>
+            <w:r>
+              <w:t>01,Empty</w:t>
+            </w:r>
+            <w:proofErr w:type="gramEnd"/>
+            <w:r>
+              <w:t xml:space="preserve"> Field Validation,1. Open Login Page2. Leave Email empty3. Leave Password empty4. Click 'LOG </w:t>
+            </w:r>
+            <w:proofErr w:type="spellStart"/>
+            <w:r>
+              <w:t>IN</w:t>
+            </w:r>
+            <w:proofErr w:type="gramStart"/>
+            <w:r>
+              <w:t>',Email</w:t>
+            </w:r>
+            <w:proofErr w:type="spellEnd"/>
+            <w:proofErr w:type="gramEnd"/>
             <w:r>
               <w:t>: [Blank]Password: [Blank],"Error messages ""Email is required"" and ""Password is required"" should appear."</w:t>
             </w:r>
@@ -127,19 +195,37 @@
               <w:ind w:left="360"/>
             </w:pPr>
             <w:r>
-              <w:t xml:space="preserve">TC-VAL-02,Invalid Email Format,1. Enter email without @2. Enter any password3. Click 'LOG </w:t>
-            </w:r>
-            <w:proofErr w:type="spellStart"/>
-            <w:r>
-              <w:t>IN',Email</w:t>
-            </w:r>
-            <w:proofErr w:type="spellEnd"/>
+              <w:t>TC-VAL-</w:t>
+            </w:r>
+            <w:proofErr w:type="gramStart"/>
+            <w:r>
+              <w:t>02,Invalid</w:t>
+            </w:r>
+            <w:proofErr w:type="gramEnd"/>
+            <w:r>
+              <w:t xml:space="preserve"> Email Format,1. Enter email without @2. Enter any password3. Click 'LOG </w:t>
+            </w:r>
+            <w:proofErr w:type="spellStart"/>
+            <w:r>
+              <w:t>IN</w:t>
+            </w:r>
+            <w:proofErr w:type="gramStart"/>
+            <w:r>
+              <w:t>',Email</w:t>
+            </w:r>
+            <w:proofErr w:type="spellEnd"/>
+            <w:proofErr w:type="gramEnd"/>
             <w:r>
               <w:t xml:space="preserve">: </w:t>
             </w:r>
             <w:proofErr w:type="spellStart"/>
-            <w:r>
-              <w:t>sreekanth.simhadri.comPassword</w:t>
+            <w:proofErr w:type="gramStart"/>
+            <w:r>
+              <w:t>sreekanth.simhadri</w:t>
+            </w:r>
+            <w:proofErr w:type="gramEnd"/>
+            <w:r>
+              <w:t>.comPassword</w:t>
             </w:r>
             <w:proofErr w:type="spellEnd"/>
             <w:r>
@@ -158,13 +244,26 @@
               <w:ind w:left="360"/>
             </w:pPr>
             <w:r>
-              <w:t xml:space="preserve">TC-VAL-03,Missing Domain Extension,1. Enter email missing .com/.net2. Click 'LOG </w:t>
-            </w:r>
-            <w:proofErr w:type="spellStart"/>
-            <w:r>
-              <w:t>IN',Email</w:t>
-            </w:r>
-            <w:proofErr w:type="spellEnd"/>
+              <w:t>TC-VAL-</w:t>
+            </w:r>
+            <w:proofErr w:type="gramStart"/>
+            <w:r>
+              <w:t>03,Missing</w:t>
+            </w:r>
+            <w:proofErr w:type="gramEnd"/>
+            <w:r>
+              <w:t xml:space="preserve"> Domain Extension,1. Enter email missing .com/.net2. Click 'LOG </w:t>
+            </w:r>
+            <w:proofErr w:type="spellStart"/>
+            <w:r>
+              <w:t>IN</w:t>
+            </w:r>
+            <w:proofErr w:type="gramStart"/>
+            <w:r>
+              <w:t>',Email</w:t>
+            </w:r>
+            <w:proofErr w:type="spellEnd"/>
+            <w:proofErr w:type="gramEnd"/>
             <w:r>
               <w:t xml:space="preserve">: </w:t>
             </w:r>
@@ -189,13 +288,26 @@
               <w:ind w:left="360"/>
             </w:pPr>
             <w:r>
-              <w:t xml:space="preserve">TC-VAL-04,Unregistered Account,1. Enter valid format but non-existent email2. Click 'LOG </w:t>
-            </w:r>
-            <w:proofErr w:type="spellStart"/>
-            <w:r>
-              <w:t>IN',Email</w:t>
-            </w:r>
-            <w:proofErr w:type="spellEnd"/>
+              <w:t>TC-VAL-</w:t>
+            </w:r>
+            <w:proofErr w:type="gramStart"/>
+            <w:r>
+              <w:t>04,Unregistered</w:t>
+            </w:r>
+            <w:proofErr w:type="gramEnd"/>
+            <w:r>
+              <w:t xml:space="preserve"> Account,1. Enter valid format but non-existent email2. Click 'LOG </w:t>
+            </w:r>
+            <w:proofErr w:type="spellStart"/>
+            <w:r>
+              <w:t>IN</w:t>
+            </w:r>
+            <w:proofErr w:type="gramStart"/>
+            <w:r>
+              <w:t>',Email</w:t>
+            </w:r>
+            <w:proofErr w:type="spellEnd"/>
+            <w:proofErr w:type="gramEnd"/>
             <w:r>
               <w:t>: unknown_user_99@test.comPassword: AnyPass123,"""Invalid email or password"" error is displayed."</w:t>
             </w:r>
@@ -212,13 +324,26 @@
               <w:ind w:left="360"/>
             </w:pPr>
             <w:r>
-              <w:t xml:space="preserve">TC-VAL-05,Incorrect Password,1. Enter registered email2. Enter wrong password3. Click 'LOG </w:t>
-            </w:r>
-            <w:proofErr w:type="spellStart"/>
-            <w:r>
-              <w:t>IN',Email</w:t>
-            </w:r>
-            <w:proofErr w:type="spellEnd"/>
+              <w:t>TC-VAL-</w:t>
+            </w:r>
+            <w:proofErr w:type="gramStart"/>
+            <w:r>
+              <w:t>05,Incorrect</w:t>
+            </w:r>
+            <w:proofErr w:type="gramEnd"/>
+            <w:r>
+              <w:t xml:space="preserve"> Password,1. Enter registered email2. Enter wrong password3. Click 'LOG </w:t>
+            </w:r>
+            <w:proofErr w:type="spellStart"/>
+            <w:r>
+              <w:t>IN</w:t>
+            </w:r>
+            <w:proofErr w:type="gramStart"/>
+            <w:r>
+              <w:t>',Email</w:t>
+            </w:r>
+            <w:proofErr w:type="spellEnd"/>
+            <w:proofErr w:type="gramEnd"/>
             <w:r>
               <w:t xml:space="preserve">: </w:t>
             </w:r>
@@ -243,13 +368,26 @@
               <w:ind w:left="360"/>
             </w:pPr>
             <w:r>
-              <w:t xml:space="preserve">TC-VAL-06,Case Sensitivity (Password),1. Enter registered email2. Enter password in wrong case3. Click 'LOG </w:t>
-            </w:r>
-            <w:proofErr w:type="spellStart"/>
-            <w:r>
-              <w:t>IN',Email</w:t>
-            </w:r>
-            <w:proofErr w:type="spellEnd"/>
+              <w:t>TC-VAL-</w:t>
+            </w:r>
+            <w:proofErr w:type="gramStart"/>
+            <w:r>
+              <w:t>06,Case</w:t>
+            </w:r>
+            <w:proofErr w:type="gramEnd"/>
+            <w:r>
+              <w:t xml:space="preserve"> Sensitivity (Password),1. Enter registered email2. Enter password in wrong case3. Click 'LOG </w:t>
+            </w:r>
+            <w:proofErr w:type="spellStart"/>
+            <w:r>
+              <w:t>IN</w:t>
+            </w:r>
+            <w:proofErr w:type="gramStart"/>
+            <w:r>
+              <w:t>',Email</w:t>
+            </w:r>
+            <w:proofErr w:type="spellEnd"/>
+            <w:proofErr w:type="gramEnd"/>
             <w:r>
               <w:t xml:space="preserve">: </w:t>
             </w:r>
@@ -274,21 +412,44 @@
               <w:ind w:left="360"/>
             </w:pPr>
             <w:r>
-              <w:t xml:space="preserve">TC-VAL-07,SQL Injection Attempt,1. Enter SQL query in Email field2. Click 'LOG </w:t>
-            </w:r>
-            <w:proofErr w:type="spellStart"/>
-            <w:r>
-              <w:t>IN',Email</w:t>
-            </w:r>
-            <w:proofErr w:type="spellEnd"/>
+              <w:t>TC-VAL-</w:t>
+            </w:r>
+            <w:proofErr w:type="gramStart"/>
+            <w:r>
+              <w:t>07,SQL</w:t>
+            </w:r>
+            <w:proofErr w:type="gramEnd"/>
+            <w:r>
+              <w:t xml:space="preserve"> Injection Attempt,1. Enter SQL query in </w:t>
+            </w:r>
+            <w:proofErr w:type="gramStart"/>
+            <w:r>
+              <w:t>Email</w:t>
+            </w:r>
+            <w:proofErr w:type="gramEnd"/>
+            <w:r>
+              <w:t xml:space="preserve"> field2. Click 'LOG </w:t>
+            </w:r>
+            <w:proofErr w:type="spellStart"/>
+            <w:r>
+              <w:t>IN</w:t>
+            </w:r>
+            <w:proofErr w:type="gramStart"/>
+            <w:r>
+              <w:t>',Email</w:t>
+            </w:r>
+            <w:proofErr w:type="spellEnd"/>
+            <w:proofErr w:type="gramEnd"/>
             <w:r>
               <w:t xml:space="preserve">: ' OR 1=1 --Password: </w:t>
             </w:r>
             <w:proofErr w:type="spellStart"/>
+            <w:proofErr w:type="gramStart"/>
             <w:r>
               <w:t>any,System</w:t>
             </w:r>
             <w:proofErr w:type="spellEnd"/>
+            <w:proofErr w:type="gramEnd"/>
             <w:r>
               <w:t xml:space="preserve"> rejects input; no bypass or database error occurs.</w:t>
             </w:r>
@@ -305,13 +466,26 @@
               <w:ind w:left="360"/>
             </w:pPr>
             <w:r>
-              <w:t xml:space="preserve">TC-VAL-08,Leading/Trailing Spaces,1. Enter email with leading space2. Enter valid password3. Click 'LOG </w:t>
-            </w:r>
-            <w:proofErr w:type="spellStart"/>
-            <w:r>
-              <w:t>IN',Email</w:t>
-            </w:r>
-            <w:proofErr w:type="spellEnd"/>
+              <w:t>TC-VAL-</w:t>
+            </w:r>
+            <w:proofErr w:type="gramStart"/>
+            <w:r>
+              <w:t>08,Leading</w:t>
+            </w:r>
+            <w:proofErr w:type="gramEnd"/>
+            <w:r>
+              <w:t xml:space="preserve">/Trailing Spaces,1. Enter email with leading space2. Enter valid password3. Click 'LOG </w:t>
+            </w:r>
+            <w:proofErr w:type="spellStart"/>
+            <w:r>
+              <w:t>IN</w:t>
+            </w:r>
+            <w:proofErr w:type="gramStart"/>
+            <w:r>
+              <w:t>',Email</w:t>
+            </w:r>
+            <w:proofErr w:type="spellEnd"/>
+            <w:proofErr w:type="gramEnd"/>
             <w:r>
               <w:t xml:space="preserve">:   </w:t>
             </w:r>
@@ -321,7 +495,15 @@
             </w:r>
             <w:proofErr w:type="spellEnd"/>
             <w:r>
-              <w:t>: ValidPass123,System should either trim spaces and log in or show a format error.</w:t>
+              <w:t>: ValidPass</w:t>
+            </w:r>
+            <w:proofErr w:type="gramStart"/>
+            <w:r>
+              <w:t>123,System</w:t>
+            </w:r>
+            <w:proofErr w:type="gramEnd"/>
+            <w:r>
+              <w:t xml:space="preserve"> should either trim spaces and log in or show a format error.</w:t>
             </w:r>
           </w:p>
           <w:p>
@@ -336,15 +518,45 @@
               <w:ind w:left="360"/>
             </w:pPr>
             <w:r>
-              <w:t xml:space="preserve">TC-VAL-09,Special Characters,1. Enter email with illegal chars2. Click 'LOG </w:t>
-            </w:r>
-            <w:proofErr w:type="spellStart"/>
-            <w:r>
-              <w:t>IN',Email</w:t>
-            </w:r>
-            <w:proofErr w:type="spellEnd"/>
-            <w:r>
-              <w:t>: user!#$%^&amp;*()@domain.comPassword: Test123,"System displays ""Invalid email format."""</w:t>
+              <w:lastRenderedPageBreak/>
+              <w:t>TC-VAL-</w:t>
+            </w:r>
+            <w:proofErr w:type="gramStart"/>
+            <w:r>
+              <w:t>09,Special</w:t>
+            </w:r>
+            <w:proofErr w:type="gramEnd"/>
+            <w:r>
+              <w:t xml:space="preserve"> Characters,1. Enter email with illegal chars2. Click 'LOG </w:t>
+            </w:r>
+            <w:proofErr w:type="spellStart"/>
+            <w:r>
+              <w:t>IN</w:t>
+            </w:r>
+            <w:proofErr w:type="gramStart"/>
+            <w:r>
+              <w:t>',Email</w:t>
+            </w:r>
+            <w:proofErr w:type="spellEnd"/>
+            <w:proofErr w:type="gramEnd"/>
+            <w:r>
+              <w:t xml:space="preserve">: </w:t>
+            </w:r>
+            <w:proofErr w:type="gramStart"/>
+            <w:r>
+              <w:t>user!#</w:t>
+            </w:r>
+            <w:proofErr w:type="gramEnd"/>
+            <w:r>
+              <w:t>$%^&amp;*</w:t>
+            </w:r>
+            <w:proofErr w:type="gramStart"/>
+            <w:r>
+              <w:t>()@domain.comPassword</w:t>
+            </w:r>
+            <w:proofErr w:type="gramEnd"/>
+            <w:r>
+              <w:t>: Test123,"System displays ""Invalid email format."""</w:t>
             </w:r>
           </w:p>
         </w:tc>
@@ -405,7 +617,15 @@
             </w:r>
             <w:proofErr w:type="spellEnd"/>
             <w:r>
-              <w:t xml:space="preserve">, while executing tests we should be in a position to send the </w:t>
+              <w:t xml:space="preserve">, while executing tests we should be </w:t>
+            </w:r>
+            <w:proofErr w:type="gramStart"/>
+            <w:r>
+              <w:t>in a position</w:t>
+            </w:r>
+            <w:proofErr w:type="gramEnd"/>
+            <w:r>
+              <w:t xml:space="preserve"> to send the </w:t>
             </w:r>
             <w:proofErr w:type="spellStart"/>
             <w:r>

</xml_diff>